<commit_message>
PNAS: implement TODOs, check length, suggest reviewers
- Income measures explained in the Results; Figure 1 with four panels
  (WVS satisfaction, Gallup ladder, WVS mean happiness, WVS-Gallup gap)
- Length within the PNAS 6-page standard (about 3,050 counted words,
  28 references, 3 display items); article type "Research Report"
- Suggested reviewers with verified emails; cover letter updated

Co-Authored-By: Claude Opus 5.5 <noreply@anthropic.com>
Claude-Session: https://claude.ai/code/session_01Le5VwdePcLrubzQ7GsXPNq
</commit_message>
<xml_diff>
--- a/papers/submission/cover_letter_pnas.docx
+++ b/papers/submission/cover_letter_pnas.docx
@@ -88,7 +88,7 @@
           <w:sz w:val="23"/>
           <w:szCs w:val="23"/>
         </w:rPr>
-        <w:t xml:space="preserve">Re: Direct Submission of the Research Article “Whether richer countries are happier depends on the survey” (Social Sciences, Economic Sciences)</w:t>
+        <w:t xml:space="preserve">Re: Direct Submission of the Research Report “Whether richer countries are happier depends on the survey” (Social Sciences, Economic Sciences)</w:t>
       </w:r>
     </w:p>
     <w:p>
@@ -116,7 +116,7 @@
           <w:sz w:val="23"/>
           <w:szCs w:val="23"/>
         </w:rPr>
-        <w:t xml:space="preserve">I submit for your consideration the enclosed Research Article. It addresses a question of broad scientific and policy interest: do richer countries have higher well-being, and how far does national income predict it? The positive cross-country relation between log GDP per capita and average life evaluations, documented with the Gallup World Poll, is one of the most cited facts of well-being research and underpins rankings of the happiest countries as well as the view that growth delivers well-being.</w:t>
+        <w:t xml:space="preserve">I submit for your consideration the enclosed Research Report. It addresses a question of broad scientific and policy interest: do richer countries have higher well-being, and how far does national income predict it? The positive cross-country relation between log GDP per capita and average life evaluations, documented with the Gallup World Poll, is one of the most cited facts of well-being research and underpins rankings of the happiest countries as well as the view that growth delivers well-being.</w:t>
       </w:r>
     </w:p>
     <w:p>

</xml_diff>